<commit_message>
export doc with new template
</commit_message>
<xml_diff>
--- a/source/TruckRouteApp/assets/Template.docx
+++ b/source/TruckRouteApp/assets/Template.docx
@@ -208,7 +208,7 @@
         <w:t xml:space="preserve">                 </w:t>
       </w:r>
     </w:p>
-    <w:p xmlns:wp14="http://schemas.microsoft.com/office/word/2010/wordml" wp14:textId="180CB7C1">
+    <w:p xmlns:wp14="http://schemas.microsoft.com/office/word/2010/wordml" wp14:textId="5AC356A5">
       <w:pPr>
         <w:jc w:val="left"/>
         <w:rPr>
@@ -223,17 +223,12 @@
         </w:rPr>
         <w:t xml:space="preserve">              </w:t>
       </w:r>
-    </w:p>
-    <w:p xmlns:wp14="http://schemas.microsoft.com/office/word/2010/wordml" wp14:textId="77777777">
-      <w:pPr>
-        <w:jc w:val="left"/>
-      </w:pPr>
       <w:r>
         <w:rPr>
           <w:sz w:val="96"/>
           <w:szCs w:val="96"/>
         </w:rPr>
-        <w:t xml:space="preserve">                                                    </w:t>
+        <w:t xml:space="preserve">                           </w:t>
       </w:r>
     </w:p>
     <w:sectPr>

</xml_diff>